<commit_message>
feat: v1.1.0 — 加入自動更新通知 + build/release 工作流
新功能(同事感受):
  • Web UI 頂部會跳「🔔 新版本可下載」黃色 banner,按一下就跳轉 GitHub Releases
    - 後端 /api/version 4 小時快取一次,輕量、不會打爆 rate limit
    - 沒網路會靜默失敗,不影響工具運作
    - 使用者按 ✕ 可關掉該版本通知(localStorage 記住)
    - footer 顯示目前版本號

Tony 的發版流程:
  • _version.py 改 VERSION → git push → .\build.ps1 -Release 一條龍
  • build.ps1 自動跑 PyInstaller + 壓 zip + gh release create
  • 同事 4 小時內會看到通知,點下載 → 解壓覆蓋 → 重啟

字典累積保護(避免更新覆蓋學習資料):
  • dictionary.db → 改名為 dictionary.seed.db (bundled 進 zip 的種子)
  • launcher 第一次跑會從 seed 複製出 dictionary.db (這份才是同事累積學習用的)
  • 更新時新 zip 只覆蓋 seed,dictionary.db 完全不會被動

文件更新(使用教學.docx):
  • 版本號 1.0 → 1.1.0
  • 安裝位置改用警告語:避免 OneDrive/Dropbox/Program Files/網路硬碟
  • Q4 port 5000 答案重寫(現在自動 fallback,不用手動改)
  • 新增 Q11(更新通知怎麼處理) + Q12(字典累積不會被覆蓋)
  • 檔案結構圖加入 dictionary.seed.db 跟 dictionary.db 區分

Co-Authored-By: Claude Opus 4.7 (1M context) <noreply@anthropic.com>
</commit_message>
<xml_diff>
--- a/使用教學.docx
+++ b/使用教學.docx
@@ -77,7 +77,7 @@
           <w:sz w:val="20"/>
           <w:szCs w:val="20"/>
         </w:rPr>
-        <w:t xml:space="preserve">版本 1.0</w:t>
+        <w:t xml:space="preserve">版本 1.1.0</w:t>
       </w:r>
     </w:p>
     <w:p>
@@ -1017,7 +1017,9 @@
         <w:t xml:space="preserve">GRC-團名修正工具/
   ├── GRC-團名修正工具.exe       ← 雙擊這個啟動！
   ├── _internal/                  ← 程式需要的東西（不要刪！）
-  └── dictionary.db               ← 字典資料庫（不要刪！）</w:t>
+  ├── templates/, static/         ← 網頁畫面（不要刪！）
+  ├── dictionary.seed.db          ← 預灌字典種子（不要刪！）
+  └── dictionary.db               ← 你的累積學習資料（第一次跑會自動產生，更新版本時不會被覆蓋）</w:t>
       </w:r>
     </w:p>
     <w:p>
@@ -1085,7 +1087,7 @@
                 <w:sz w:val="22"/>
                 <w:szCs w:val="22"/>
               </w:rPr>
-              <w:t xml:space="preserve">請把整個資料夾放到一個固定位置（例如桌面或 D 槽），不要只複製 exe 出來。</w:t>
+              <w:t xml:space="preserve">請把整個資料夾放到一個固定位置（建議：桌面、C:\GRC工具\、或 D 槽根目錄），不要只複製 exe 出來。⚠ 不要放在：OneDrive / Dropbox 同步資料夾（會產生衝突檔讓字典壞掉）、Program Files（沒寫入權限）、網路硬碟（會卡慢甚至下載失敗）。</w:t>
             </w:r>
           </w:p>
           <w:p>
@@ -5315,7 +5317,7 @@
           <w:sz w:val="22"/>
           <w:szCs w:val="22"/>
         </w:rPr>
-        <w:t xml:space="preserve">A：有其他程式在用 5000 port。關掉其他程式（特別是其他開發工具、Skype 舊版）再試。如果還是不行，請主管改 port 號碼。</w:t>
+        <w:t xml:space="preserve">A：v1.1 之後，工具會自動找下一個可用的 port（5001、5002...），實際使用的位置會印在黑色視窗第一行。如果看到「找不到可用 port」表示 5000~5019 全被占，請關掉其他開發工具（Skype 舊版、其他 web server）後重試；還是不行請聯絡主管。</w:t>
       </w:r>
     </w:p>
     <w:p>
@@ -5571,6 +5573,73 @@
     </w:p>
     <w:p>
       <w:pPr>
+        <w:pStyle w:val="Heading3"/>
+        <w:spacing w:after="100" w:before="200"/>
+      </w:pPr>
+      <w:r>
+        <w:rPr>
+          <w:rFonts w:ascii="Microsoft JhengHei" w:cs="Microsoft JhengHei" w:eastAsia="Microsoft JhengHei" w:hAnsi="Microsoft JhengHei"/>
+          <w:b/>
+          <w:bCs/>
+          <w:color w:val="1E293B"/>
+          <w:sz w:val="24"/>
+          <w:szCs w:val="24"/>
+        </w:rPr>
+        <w:t xml:space="preserve">Q11：頁面上方跳出黃色的「🔔 新版本可下載」是什麼？</w:t>
+      </w:r>
+    </w:p>
+    <w:p>
+      <w:pPr>
+        <w:spacing w:after="100" w:line="340"/>
+      </w:pPr>
+      <w:r>
+        <w:rPr>
+          <w:rFonts w:ascii="Microsoft JhengHei" w:cs="Microsoft JhengHei" w:eastAsia="Microsoft JhengHei" w:hAnsi="Microsoft JhengHei"/>
+          <w:color w:val="1E293B"/>
+          <w:sz w:val="22"/>
+          <w:szCs w:val="22"/>
+        </w:rPr>
+        <w:t xml:space="preserve">A：表示工具有新版可以下載。建議的更新流程：(1) 點「立即前往下載」按鈕，瀏覽器會開到 GitHub 下載頁。(2) 下載最新的 zip。(3) 關掉黑色視窗（程式停止）。(4) 解壓縮後，把新資料夾的內容覆蓋到你原本的工具資料夾。(5) 雙擊 GRC-團名修正工具.exe 重新啟動。⭐ 你的字典 dictionary.db 不會被覆蓋，累積學習都會保留。如果暫時不想更新，點右邊的 ✕ 關掉通知（這個版本之後不會再跳）。</w:t>
+      </w:r>
+    </w:p>
+    <w:p>
+      <w:pPr>
+        <w:spacing w:after="120"/>
+      </w:pPr>
+    </w:p>
+    <w:p>
+      <w:pPr>
+        <w:pStyle w:val="Heading3"/>
+        <w:spacing w:after="100" w:before="200"/>
+      </w:pPr>
+      <w:r>
+        <w:rPr>
+          <w:rFonts w:ascii="Microsoft JhengHei" w:cs="Microsoft JhengHei" w:eastAsia="Microsoft JhengHei" w:hAnsi="Microsoft JhengHei"/>
+          <w:b/>
+          <w:bCs/>
+          <w:color w:val="1E293B"/>
+          <w:sz w:val="24"/>
+          <w:szCs w:val="24"/>
+        </w:rPr>
+        <w:t xml:space="preserve">Q12：更新版本會不會把我累積的字典學習沖掉？</w:t>
+      </w:r>
+    </w:p>
+    <w:p>
+      <w:pPr>
+        <w:spacing w:after="100" w:line="340"/>
+      </w:pPr>
+      <w:r>
+        <w:rPr>
+          <w:rFonts w:ascii="Microsoft JhengHei" w:cs="Microsoft JhengHei" w:eastAsia="Microsoft JhengHei" w:hAnsi="Microsoft JhengHei"/>
+          <w:color w:val="1E293B"/>
+          <w:sz w:val="22"/>
+          <w:szCs w:val="22"/>
+        </w:rPr>
+        <w:t xml:space="preserve">A：不會。v1.1 之後的版本把「預灌字典種子（dictionary.seed.db）」跟「你的學習資料（dictionary.db）」分開存。新版 zip 只會覆蓋 seed 那一份，你的 dictionary.db 完全不會被動。萬一還是不放心，更新前可以先把 dictionary.db 複製一份備份起來，更新後再貼回去。</w:t>
+      </w:r>
+    </w:p>
+    <w:p>
+      <w:pPr>
         <w:spacing w:after="120"/>
       </w:pPr>
     </w:p>
@@ -5629,7 +5698,7 @@
           <w:sz w:val="20"/>
           <w:szCs w:val="20"/>
         </w:rPr>
-        <w:t xml:space="preserve">© 2026 台中勤美洲際酒店 · 版本 1.0</w:t>
+        <w:t xml:space="preserve">© 2026 台中勤美洲際酒店 · 版本 1.1.0</w:t>
       </w:r>
     </w:p>
     <w:sectPr>

</xml_diff>